<commit_message>
Paula QS Parte 1: gancho com Leonardo/Talismã
Co-Authored-By: Claude Opus 5.5 <noreply@anthropic.com>
Claude-Session: https://claude.ai/code/session_01MJjUEEZrxQDEUifKK2vj9g
</commit_message>
<xml_diff>
--- a/roteiros/paula-fernandes-2/PaulaQS_Parte1.docx
+++ b/roteiros/paula-fernandes-2/PaulaQS_Parte1.docx
@@ -23,7 +23,7 @@
         <w:rPr>
           <w:color w:val="C00000"/>
         </w:rPr>
-        <w:t>O que pouca gente sabe é que, naquela noite, ela já tinha decidido como ia acontecer. E só uma pessoa, dentro daquela casa, conseguiu impedir.</w:t>
+        <w:t>O que pouca gente sabe é que, no auge da fama, ela entrou na Justiça contra a empresa de um dos maiores cantores do Brasil, Leonardo. E perdeu.</w:t>
       </w:r>
     </w:p>
     <w:p>
@@ -31,7 +31,7 @@
         <w:rPr>
           <w:color w:val="C00000"/>
         </w:rPr>
-        <w:t>Fique até o final, porque você vai descobrir o que aconteceu naquela noite sombria. E o que ela viveu, no auge da fama, nos bastidores que o Brasil nunca viu.</w:t>
+        <w:t>Fique até o final, porque você vai descobrir o que aconteceu naquela noite sombria. E o que havia naquele contrato que, anos depois, ela disse que não combinava com o caráter dela.</w:t>
       </w:r>
     </w:p>
     <w:p>

</xml_diff>

<commit_message>
Paula QS Parte 1: gancho com segredo sombrio
Co-Authored-By: Claude Opus 5.5 <noreply@anthropic.com>
Claude-Session: https://claude.ai/code/session_01MJjUEEZrxQDEUifKK2vj9g
</commit_message>
<xml_diff>
--- a/roteiros/paula-fernandes-2/PaulaQS_Parte1.docx
+++ b/roteiros/paula-fernandes-2/PaulaQS_Parte1.docx
@@ -15,7 +15,7 @@
         <w:rPr>
           <w:color w:val="C00000"/>
         </w:rPr>
-        <w:t>Paula Fernandes passou quinze anos sendo chamada de antipática pelo Brasil, enquanto escondia a noite em que quase tirou a própria vida.</w:t>
+        <w:t>Paula Fernandes passou quinze anos sendo chamada de antipática pelo Brasil. Mas, por trás daquele sorriso tímido, ela escondia um segredo sombrio que quase custou a própria vida.</w:t>
       </w:r>
     </w:p>
     <w:p>
@@ -23,7 +23,7 @@
         <w:rPr>
           <w:color w:val="C00000"/>
         </w:rPr>
-        <w:t>O que pouca gente sabe é que, no auge da fama, ela entrou na Justiça contra a empresa de um dos maiores cantores do Brasil, Leonardo. E perdeu.</w:t>
+        <w:t>O que pouca gente sabe é que, no auge da fama, existia um contrato com a empresa de Leonardo que ela tentou destruir na Justiça. E até hoje ela evita dizer o que havia naquele papel que não combinava com o caráter dela.</w:t>
       </w:r>
     </w:p>
     <w:p>
@@ -31,7 +31,7 @@
         <w:rPr>
           <w:color w:val="C00000"/>
         </w:rPr>
-        <w:t>Fique até o final, porque você vai descobrir o que aconteceu naquela noite sombria. E o que havia naquele contrato que, anos depois, ela disse que não combinava com o caráter dela.</w:t>
+        <w:t>Fique até o final, porque você vai descobrir o segredo que Paula Fernandes escondeu. E o que realmente acontecia longe dos palcos, enquanto o Brasil inteiro cantava com ela.</w:t>
       </w:r>
     </w:p>
     <w:p>

</xml_diff>

<commit_message>
Paula QS Parte 1: gancho mais enxuto
Co-Authored-By: Claude Opus 5.5 <noreply@anthropic.com>
Claude-Session: https://claude.ai/code/session_01MJjUEEZrxQDEUifKK2vj9g
</commit_message>
<xml_diff>
--- a/roteiros/paula-fernandes-2/PaulaQS_Parte1.docx
+++ b/roteiros/paula-fernandes-2/PaulaQS_Parte1.docx
@@ -15,7 +15,7 @@
         <w:rPr>
           <w:color w:val="C00000"/>
         </w:rPr>
-        <w:t>Paula Fernandes passou quinze anos sendo chamada de antipática pelo Brasil. Mas, por trás daquele sorriso tímido, ela escondia um segredo sombrio que quase custou a própria vida.</w:t>
+        <w:t>Paula Fernandes guardou durante anos um segredo sombrio que quase custou a própria vida.</w:t>
       </w:r>
     </w:p>
     <w:p>
@@ -23,7 +23,7 @@
         <w:rPr>
           <w:color w:val="C00000"/>
         </w:rPr>
-        <w:t>O que pouca gente sabe é que, no auge da fama, existia um contrato com a empresa de Leonardo que ela tentou destruir na Justiça. E até hoje ela evita dizer o que havia naquele papel que não combinava com o caráter dela.</w:t>
+        <w:t>O que pouca gente sabe é que, no auge da fama, existia um papel assinado com a empresa de Leonardo. E até hoje ela evita dizer o que havia nele.</w:t>
       </w:r>
     </w:p>
     <w:p>
@@ -31,7 +31,7 @@
         <w:rPr>
           <w:color w:val="C00000"/>
         </w:rPr>
-        <w:t>Fique até o final, porque você vai descobrir o segredo que Paula Fernandes escondeu. E o que realmente acontecia longe dos palcos, enquanto o Brasil inteiro cantava com ela.</w:t>
+        <w:t>Fique até o final, porque você vai descobrir o segredo que Paula Fernandes escondeu do Brasil. E o que acontecia com ela quando as luzes do palco se apagavam.</w:t>
       </w:r>
     </w:p>
     <w:p>

</xml_diff>

<commit_message>
Paula QS Parte 1: revisão
Co-Authored-By: Claude Opus 5.5 <noreply@anthropic.com>
Claude-Session: https://claude.ai/code/session_01MJjUEEZrxQDEUifKK2vj9g
</commit_message>
<xml_diff>
--- a/roteiros/paula-fernandes-2/PaulaQS_Parte1.docx
+++ b/roteiros/paula-fernandes-2/PaulaQS_Parte1.docx
@@ -23,7 +23,7 @@
         <w:rPr>
           <w:color w:val="C00000"/>
         </w:rPr>
-        <w:t>O que pouca gente sabe é que, no auge da fama, existia um papel assinado com a empresa de Leonardo. E até hoje ela evita dizer o que havia nele.</w:t>
+        <w:t>O que pouca gente sabe é que, no auge da fama, existia um papel assinado com a empresa de Leonardo. E até hoje ela evita dar detalhes do que havia nele.</w:t>
       </w:r>
     </w:p>
     <w:p>
@@ -39,7 +39,7 @@
         <w:rPr>
           <w:color w:val="000000"/>
         </w:rPr>
-        <w:t>Para entender aquela noite, é preciso voltar a uma menina que cresceu num lugar onde quase nada chegava.</w:t>
+        <w:t>Para entender esse segredo, é preciso voltar a uma menina que cresceu num lugar onde quase nada chegava.</w:t>
       </w:r>
     </w:p>
     <w:p>

</xml_diff>